<commit_message>
- 2 windows are written in the interface - The system for saving settings on the disk has been started - template.docx has been modified
</commit_message>
<xml_diff>
--- a/test.docx
+++ b/test.docx
@@ -27,8 +27,9 @@
           </w:tcPr>
           <w:tbl>
             <w:tblPr>
-              <w:tblW w:w="5610" w:type="dxa"/>
-              <w:tblInd w:w="149" w:type="dxa"/>
+              <w:tblpPr w:leftFromText="180" w:rightFromText="180" w:horzAnchor="margin" w:tblpY="310"/>
+              <w:tblOverlap w:val="never"/>
+              <w:tblW w:w="5439" w:type="dxa"/>
               <w:tblLayout w:type="fixed"/>
               <w:tblCellMar>
                 <w:left w:w="0" w:type="dxa"/>
@@ -37,16 +38,16 @@
               <w:tblLook w:val="04A0" w:firstRow="1" w:lastRow="0" w:firstColumn="1" w:lastColumn="0" w:noHBand="0" w:noVBand="1"/>
             </w:tblPr>
             <w:tblGrid>
-              <w:gridCol w:w="1589"/>
-              <w:gridCol w:w="4021"/>
+              <w:gridCol w:w="1540"/>
+              <w:gridCol w:w="3899"/>
             </w:tblGrid>
             <w:tr>
               <w:trPr>
-                <w:trHeight w:val="997"/>
+                <w:trHeight w:val="912"/>
               </w:trPr>
               <w:tc>
                 <w:tcPr>
-                  <w:tcW w:w="5610" w:type="dxa"/>
+                  <w:tcW w:w="5439" w:type="dxa"/>
                   <w:gridSpan w:val="2"/>
                   <w:vAlign w:val="center"/>
                 </w:tcPr>
@@ -102,11 +103,11 @@
             </w:tr>
             <w:tr>
               <w:trPr>
-                <w:trHeight w:val="294"/>
+                <w:trHeight w:val="269"/>
               </w:trPr>
               <w:tc>
                 <w:tcPr>
-                  <w:tcW w:w="5610" w:type="dxa"/>
+                  <w:tcW w:w="5439" w:type="dxa"/>
                   <w:gridSpan w:val="2"/>
                 </w:tcPr>
                 <w:p>
@@ -132,11 +133,11 @@
             </w:tr>
             <w:tr>
               <w:trPr>
-                <w:trHeight w:val="919"/>
+                <w:trHeight w:val="840"/>
               </w:trPr>
               <w:tc>
                 <w:tcPr>
-                  <w:tcW w:w="1589" w:type="dxa"/>
+                  <w:tcW w:w="1540" w:type="dxa"/>
                   <w:vAlign w:val="center"/>
                 </w:tcPr>
                 <w:p>
@@ -167,7 +168,7 @@
               </w:tc>
               <w:tc>
                 <w:tcPr>
-                  <w:tcW w:w="4021" w:type="dxa"/>
+                  <w:tcW w:w="3899" w:type="dxa"/>
                   <w:vAlign w:val="center"/>
                 </w:tcPr>
                 <w:p>
@@ -189,11 +190,11 @@
             </w:tr>
             <w:tr>
               <w:trPr>
-                <w:trHeight w:val="814"/>
+                <w:trHeight w:val="744"/>
               </w:trPr>
               <w:tc>
                 <w:tcPr>
-                  <w:tcW w:w="1589" w:type="dxa"/>
+                  <w:tcW w:w="1540" w:type="dxa"/>
                   <w:vAlign w:val="center"/>
                 </w:tcPr>
                 <w:p>
@@ -224,7 +225,7 @@
               </w:tc>
               <w:tc>
                 <w:tcPr>
-                  <w:tcW w:w="4021" w:type="dxa"/>
+                  <w:tcW w:w="3899" w:type="dxa"/>
                   <w:vAlign w:val="center"/>
                 </w:tcPr>
                 <w:p>
@@ -246,11 +247,11 @@
             </w:tr>
             <w:tr>
               <w:trPr>
-                <w:trHeight w:val="231"/>
+                <w:trHeight w:val="211"/>
               </w:trPr>
               <w:tc>
                 <w:tcPr>
-                  <w:tcW w:w="5610" w:type="dxa"/>
+                  <w:tcW w:w="5439" w:type="dxa"/>
                   <w:gridSpan w:val="2"/>
                 </w:tcPr>
                 <w:p>
@@ -322,11 +323,11 @@
             </w:tr>
             <w:tr>
               <w:trPr>
-                <w:trHeight w:val="400"/>
+                <w:trHeight w:val="366"/>
               </w:trPr>
               <w:tc>
                 <w:tcPr>
-                  <w:tcW w:w="5610" w:type="dxa"/>
+                  <w:tcW w:w="5439" w:type="dxa"/>
                   <w:gridSpan w:val="2"/>
                 </w:tcPr>
                 <w:p>
@@ -365,6 +366,8 @@
           </w:tcPr>
           <w:tbl>
             <w:tblPr>
+              <w:tblpPr w:leftFromText="180" w:rightFromText="180" w:horzAnchor="margin" w:tblpY="300"/>
+              <w:tblOverlap w:val="never"/>
               <w:tblW w:w="5832" w:type="dxa"/>
               <w:tblLayout w:type="fixed"/>
               <w:tblCellMar>
@@ -703,8 +706,9 @@
           </w:tcPr>
           <w:tbl>
             <w:tblPr>
+              <w:tblpPr w:leftFromText="180" w:rightFromText="180" w:horzAnchor="margin" w:tblpY="270"/>
+              <w:tblOverlap w:val="never"/>
               <w:tblW w:w="5594" w:type="dxa"/>
-              <w:tblInd w:w="149" w:type="dxa"/>
               <w:tblLayout w:type="fixed"/>
               <w:tblCellMar>
                 <w:left w:w="0" w:type="dxa"/>
@@ -849,7 +853,7 @@
               </w:tc>
               <w:tc>
                 <w:tcPr>
-                  <w:tcW w:w="4011" w:type="dxa"/>
+                  <w:tcW w:w="4012" w:type="dxa"/>
                   <w:vAlign w:val="center"/>
                 </w:tcPr>
                 <w:p>
@@ -908,7 +912,7 @@
               </w:tc>
               <w:tc>
                 <w:tcPr>
-                  <w:tcW w:w="4011" w:type="dxa"/>
+                  <w:tcW w:w="4012" w:type="dxa"/>
                   <w:vAlign w:val="center"/>
                 </w:tcPr>
                 <w:p>
@@ -1038,6 +1042,8 @@
           </w:tcPr>
           <w:tbl>
             <w:tblPr>
+              <w:tblpPr w:leftFromText="180" w:rightFromText="180" w:horzAnchor="margin" w:tblpY="300"/>
+              <w:tblOverlap w:val="never"/>
               <w:tblW w:w="5823" w:type="dxa"/>
               <w:tblLayout w:type="fixed"/>
               <w:tblCellMar>
@@ -1376,8 +1382,9 @@
           </w:tcPr>
           <w:tbl>
             <w:tblPr>
+              <w:tblpPr w:leftFromText="180" w:rightFromText="180" w:horzAnchor="margin" w:tblpY="370"/>
+              <w:tblOverlap w:val="never"/>
               <w:tblW w:w="5591" w:type="dxa"/>
-              <w:tblInd w:w="149" w:type="dxa"/>
               <w:tblLayout w:type="fixed"/>
               <w:tblCellMar>
                 <w:left w:w="0" w:type="dxa"/>
@@ -1501,7 +1508,7 @@
               </w:tc>
               <w:tc>
                 <w:tcPr>
-                  <w:tcW w:w="2733" w:type="dxa"/>
+                  <w:tcW w:w="2734" w:type="dxa"/>
                   <w:vAlign w:val="center"/>
                 </w:tcPr>
                 <w:p>
@@ -1548,7 +1555,7 @@
               </w:tc>
               <w:tc>
                 <w:tcPr>
-                  <w:tcW w:w="2733" w:type="dxa"/>
+                  <w:tcW w:w="2734" w:type="dxa"/>
                   <w:vAlign w:val="center"/>
                 </w:tcPr>
                 <w:p>
@@ -1674,6 +1681,8 @@
           </w:tcPr>
           <w:tbl>
             <w:tblPr>
+              <w:tblpPr w:leftFromText="180" w:rightFromText="180" w:horzAnchor="margin" w:tblpY="320"/>
+              <w:tblOverlap w:val="never"/>
               <w:tblW w:w="5808" w:type="dxa"/>
               <w:tblLayout w:type="fixed"/>
               <w:tblCellMar>
@@ -1798,7 +1807,7 @@
               </w:tc>
               <w:tc>
                 <w:tcPr>
-                  <w:tcW w:w="3150" w:type="dxa"/>
+                  <w:tcW w:w="3151" w:type="dxa"/>
                   <w:vAlign w:val="center"/>
                 </w:tcPr>
                 <w:p>
@@ -1845,7 +1854,7 @@
               </w:tc>
               <w:tc>
                 <w:tcPr>
-                  <w:tcW w:w="3150" w:type="dxa"/>
+                  <w:tcW w:w="3151" w:type="dxa"/>
                   <w:vAlign w:val="center"/>
                 </w:tcPr>
                 <w:p>
@@ -1974,8 +1983,9 @@
           </w:tcPr>
           <w:tbl>
             <w:tblPr>
+              <w:tblpPr w:leftFromText="180" w:rightFromText="180" w:horzAnchor="margin" w:tblpY="350"/>
+              <w:tblOverlap w:val="never"/>
               <w:tblW w:w="5670" w:type="dxa"/>
-              <w:tblInd w:w="149" w:type="dxa"/>
               <w:tblLayout w:type="fixed"/>
               <w:tblCellMar>
                 <w:left w:w="0" w:type="dxa"/>
@@ -2114,7 +2124,7 @@
               </w:tc>
               <w:tc>
                 <w:tcPr>
-                  <w:tcW w:w="4069" w:type="dxa"/>
+                  <w:tcW w:w="4070" w:type="dxa"/>
                   <w:vAlign w:val="center"/>
                 </w:tcPr>
                 <w:p>
@@ -2171,7 +2181,7 @@
               </w:tc>
               <w:tc>
                 <w:tcPr>
-                  <w:tcW w:w="4069" w:type="dxa"/>
+                  <w:tcW w:w="4070" w:type="dxa"/>
                   <w:vAlign w:val="center"/>
                 </w:tcPr>
                 <w:p>
@@ -2308,8 +2318,9 @@
           </w:tcPr>
           <w:tbl>
             <w:tblPr>
+              <w:tblpPr w:leftFromText="180" w:rightFromText="180" w:horzAnchor="margin" w:tblpY="290"/>
+              <w:tblOverlap w:val="never"/>
               <w:tblW w:w="5789" w:type="dxa"/>
-              <w:tblInd w:w="30" w:type="dxa"/>
               <w:tblLayout w:type="fixed"/>
               <w:tblCellMar>
                 <w:left w:w="0" w:type="dxa"/>
@@ -2663,8 +2674,9 @@
           </w:tcPr>
           <w:tbl>
             <w:tblPr>
-              <w:tblW w:w="5610" w:type="dxa"/>
-              <w:tblInd w:w="149" w:type="dxa"/>
+              <w:tblpPr w:leftFromText="180" w:rightFromText="180" w:horzAnchor="margin" w:tblpY="310"/>
+              <w:tblOverlap w:val="never"/>
+              <w:tblW w:w="5439" w:type="dxa"/>
               <w:tblLayout w:type="fixed"/>
               <w:tblCellMar>
                 <w:left w:w="0" w:type="dxa"/>
@@ -2673,16 +2685,16 @@
               <w:tblLook w:val="04A0" w:firstRow="1" w:lastRow="0" w:firstColumn="1" w:lastColumn="0" w:noHBand="0" w:noVBand="1"/>
             </w:tblPr>
             <w:tblGrid>
-              <w:gridCol w:w="1589"/>
-              <w:gridCol w:w="4021"/>
+              <w:gridCol w:w="1540"/>
+              <w:gridCol w:w="3899"/>
             </w:tblGrid>
             <w:tr>
               <w:trPr>
-                <w:trHeight w:val="997"/>
+                <w:trHeight w:val="912"/>
               </w:trPr>
               <w:tc>
                 <w:tcPr>
-                  <w:tcW w:w="5610" w:type="dxa"/>
+                  <w:tcW w:w="5439" w:type="dxa"/>
                   <w:gridSpan w:val="2"/>
                   <w:vAlign w:val="center"/>
                 </w:tcPr>
@@ -2738,11 +2750,11 @@
             </w:tr>
             <w:tr>
               <w:trPr>
-                <w:trHeight w:val="294"/>
+                <w:trHeight w:val="269"/>
               </w:trPr>
               <w:tc>
                 <w:tcPr>
-                  <w:tcW w:w="5610" w:type="dxa"/>
+                  <w:tcW w:w="5439" w:type="dxa"/>
                   <w:gridSpan w:val="2"/>
                 </w:tcPr>
                 <w:p>
@@ -2768,11 +2780,11 @@
             </w:tr>
             <w:tr>
               <w:trPr>
-                <w:trHeight w:val="919"/>
+                <w:trHeight w:val="840"/>
               </w:trPr>
               <w:tc>
                 <w:tcPr>
-                  <w:tcW w:w="1589" w:type="dxa"/>
+                  <w:tcW w:w="1540" w:type="dxa"/>
                   <w:vAlign w:val="center"/>
                 </w:tcPr>
                 <w:p>
@@ -2803,7 +2815,7 @@
               </w:tc>
               <w:tc>
                 <w:tcPr>
-                  <w:tcW w:w="4021" w:type="dxa"/>
+                  <w:tcW w:w="3899" w:type="dxa"/>
                   <w:vAlign w:val="center"/>
                 </w:tcPr>
                 <w:p>
@@ -2825,11 +2837,11 @@
             </w:tr>
             <w:tr>
               <w:trPr>
-                <w:trHeight w:val="814"/>
+                <w:trHeight w:val="744"/>
               </w:trPr>
               <w:tc>
                 <w:tcPr>
-                  <w:tcW w:w="1589" w:type="dxa"/>
+                  <w:tcW w:w="1540" w:type="dxa"/>
                   <w:vAlign w:val="center"/>
                 </w:tcPr>
                 <w:p>
@@ -2860,7 +2872,7 @@
               </w:tc>
               <w:tc>
                 <w:tcPr>
-                  <w:tcW w:w="4021" w:type="dxa"/>
+                  <w:tcW w:w="3899" w:type="dxa"/>
                   <w:vAlign w:val="center"/>
                 </w:tcPr>
                 <w:p>
@@ -2882,11 +2894,11 @@
             </w:tr>
             <w:tr>
               <w:trPr>
-                <w:trHeight w:val="231"/>
+                <w:trHeight w:val="211"/>
               </w:trPr>
               <w:tc>
                 <w:tcPr>
-                  <w:tcW w:w="5610" w:type="dxa"/>
+                  <w:tcW w:w="5439" w:type="dxa"/>
                   <w:gridSpan w:val="2"/>
                 </w:tcPr>
                 <w:p>
@@ -2958,11 +2970,11 @@
             </w:tr>
             <w:tr>
               <w:trPr>
-                <w:trHeight w:val="400"/>
+                <w:trHeight w:val="366"/>
               </w:trPr>
               <w:tc>
                 <w:tcPr>
-                  <w:tcW w:w="5610" w:type="dxa"/>
+                  <w:tcW w:w="5439" w:type="dxa"/>
                   <w:gridSpan w:val="2"/>
                 </w:tcPr>
                 <w:p>
@@ -3001,6 +3013,8 @@
           </w:tcPr>
           <w:tbl>
             <w:tblPr>
+              <w:tblpPr w:leftFromText="180" w:rightFromText="180" w:horzAnchor="margin" w:tblpY="300"/>
+              <w:tblOverlap w:val="never"/>
               <w:tblW w:w="5832" w:type="dxa"/>
               <w:tblLayout w:type="fixed"/>
               <w:tblCellMar>
@@ -3339,8 +3353,9 @@
           </w:tcPr>
           <w:tbl>
             <w:tblPr>
+              <w:tblpPr w:leftFromText="180" w:rightFromText="180" w:horzAnchor="margin" w:tblpY="270"/>
+              <w:tblOverlap w:val="never"/>
               <w:tblW w:w="5594" w:type="dxa"/>
-              <w:tblInd w:w="149" w:type="dxa"/>
               <w:tblLayout w:type="fixed"/>
               <w:tblCellMar>
                 <w:left w:w="0" w:type="dxa"/>
@@ -3485,7 +3500,7 @@
               </w:tc>
               <w:tc>
                 <w:tcPr>
-                  <w:tcW w:w="4011" w:type="dxa"/>
+                  <w:tcW w:w="4012" w:type="dxa"/>
                   <w:vAlign w:val="center"/>
                 </w:tcPr>
                 <w:p>
@@ -3544,7 +3559,7 @@
               </w:tc>
               <w:tc>
                 <w:tcPr>
-                  <w:tcW w:w="4011" w:type="dxa"/>
+                  <w:tcW w:w="4012" w:type="dxa"/>
                   <w:vAlign w:val="center"/>
                 </w:tcPr>
                 <w:p>
@@ -3674,6 +3689,8 @@
           </w:tcPr>
           <w:tbl>
             <w:tblPr>
+              <w:tblpPr w:leftFromText="180" w:rightFromText="180" w:horzAnchor="margin" w:tblpY="300"/>
+              <w:tblOverlap w:val="never"/>
               <w:tblW w:w="5823" w:type="dxa"/>
               <w:tblLayout w:type="fixed"/>
               <w:tblCellMar>
@@ -4012,8 +4029,9 @@
           </w:tcPr>
           <w:tbl>
             <w:tblPr>
+              <w:tblpPr w:leftFromText="180" w:rightFromText="180" w:horzAnchor="margin" w:tblpY="370"/>
+              <w:tblOverlap w:val="never"/>
               <w:tblW w:w="5591" w:type="dxa"/>
-              <w:tblInd w:w="149" w:type="dxa"/>
               <w:tblLayout w:type="fixed"/>
               <w:tblCellMar>
                 <w:left w:w="0" w:type="dxa"/>
@@ -4137,7 +4155,7 @@
               </w:tc>
               <w:tc>
                 <w:tcPr>
-                  <w:tcW w:w="2733" w:type="dxa"/>
+                  <w:tcW w:w="2734" w:type="dxa"/>
                   <w:vAlign w:val="center"/>
                 </w:tcPr>
                 <w:p>
@@ -4184,7 +4202,7 @@
               </w:tc>
               <w:tc>
                 <w:tcPr>
-                  <w:tcW w:w="2733" w:type="dxa"/>
+                  <w:tcW w:w="2734" w:type="dxa"/>
                   <w:vAlign w:val="center"/>
                 </w:tcPr>
                 <w:p>
@@ -4310,6 +4328,8 @@
           </w:tcPr>
           <w:tbl>
             <w:tblPr>
+              <w:tblpPr w:leftFromText="180" w:rightFromText="180" w:horzAnchor="margin" w:tblpY="320"/>
+              <w:tblOverlap w:val="never"/>
               <w:tblW w:w="5808" w:type="dxa"/>
               <w:tblLayout w:type="fixed"/>
               <w:tblCellMar>
@@ -4434,7 +4454,7 @@
               </w:tc>
               <w:tc>
                 <w:tcPr>
-                  <w:tcW w:w="3150" w:type="dxa"/>
+                  <w:tcW w:w="3151" w:type="dxa"/>
                   <w:vAlign w:val="center"/>
                 </w:tcPr>
                 <w:p>
@@ -4481,7 +4501,7 @@
               </w:tc>
               <w:tc>
                 <w:tcPr>
-                  <w:tcW w:w="3150" w:type="dxa"/>
+                  <w:tcW w:w="3151" w:type="dxa"/>
                   <w:vAlign w:val="center"/>
                 </w:tcPr>
                 <w:p>
@@ -4610,8 +4630,9 @@
           </w:tcPr>
           <w:tbl>
             <w:tblPr>
+              <w:tblpPr w:leftFromText="180" w:rightFromText="180" w:horzAnchor="margin" w:tblpY="350"/>
+              <w:tblOverlap w:val="never"/>
               <w:tblW w:w="5670" w:type="dxa"/>
-              <w:tblInd w:w="149" w:type="dxa"/>
               <w:tblLayout w:type="fixed"/>
               <w:tblCellMar>
                 <w:left w:w="0" w:type="dxa"/>
@@ -4717,7 +4738,7 @@
               </w:tc>
               <w:tc>
                 <w:tcPr>
-                  <w:tcW w:w="4069" w:type="dxa"/>
+                  <w:tcW w:w="4070" w:type="dxa"/>
                   <w:vAlign w:val="center"/>
                 </w:tcPr>
                 <w:p>
@@ -4774,7 +4795,7 @@
               </w:tc>
               <w:tc>
                 <w:tcPr>
-                  <w:tcW w:w="4069" w:type="dxa"/>
+                  <w:tcW w:w="4070" w:type="dxa"/>
                   <w:vAlign w:val="center"/>
                 </w:tcPr>
                 <w:p>
@@ -4911,8 +4932,9 @@
           </w:tcPr>
           <w:tbl>
             <w:tblPr>
+              <w:tblpPr w:leftFromText="180" w:rightFromText="180" w:horzAnchor="margin" w:tblpY="290"/>
+              <w:tblOverlap w:val="never"/>
               <w:tblW w:w="5789" w:type="dxa"/>
-              <w:tblInd w:w="30" w:type="dxa"/>
               <w:tblLayout w:type="fixed"/>
               <w:tblCellMar>
                 <w:left w:w="0" w:type="dxa"/>

</xml_diff>